<commit_message>
Staff invite privacy default (pending counsel, question 11)
- Invite SMS carries only the organization's name and the app link
  (APP_DOWNLOAD_URL), nothing about the person.
- Invites never accepted (expired, declined or revoked) are deleted, number
  and name, 30 days after they expire by the daily STAFF_INVITE_PURGE job;
  the organization keeps only an anonymous count (GET /org invite_stats).
- Data inventory notes the default so counsel can confirm or change it.

Co-Authored-By: Claude Opus 5.5 <noreply@anthropic.com>
</commit_message>
<xml_diff>
--- a/docs/DATA_INVENTORY.docx
+++ b/docs/DATA_INVENTORY.docx
@@ -2310,7 +2310,7 @@
                 <w:sz w:val="18"/>
                 <w:szCs w:val="18"/>
               </w:rPr>
-              <w:t xml:space="preserve">Mobile number and name as entered by the owner, nurse or doctor, invite status; an SMS invitation is sent to that number</w:t>
+              <w:t xml:space="preserve">Mobile number and name as entered by the owner, nurse or doctor, invite status; an SMS invitation is sent to that number. The SMS contains only the organization's name and the app link, nothing about the person.</w:t>
             </w:r>
           </w:p>
         </w:tc>
@@ -4318,7 +4318,7 @@
                 <w:sz w:val="18"/>
                 <w:szCs w:val="18"/>
               </w:rPr>
-              <w:t xml:space="preserve">Mobile number and the one-time sign-in code; for staff invites, the number and the organization's name</w:t>
+              <w:t xml:space="preserve">Mobile number and the one-time sign-in code; for staff invites, the number, the organization's name and the app link (nothing else about the person)</w:t>
             </w:r>
           </w:p>
         </w:tc>
@@ -7350,29 +7350,29 @@
                 <w:sz w:val="18"/>
                 <w:szCs w:val="18"/>
               </w:rPr>
-              <w:t xml:space="preserve">Kept (pending ones lapse after 7 days but are not erased)</w:t>
-            </w:r>
-          </w:p>
-        </w:tc>
-        <w:tc>
-          <w:tcPr>
-            <w:tcMar>
-              <w:top w:type="dxa" w:w="60"/>
-              <w:left w:type="dxa" w:w="80"/>
-              <w:bottom w:type="dxa" w:w="60"/>
-              <w:right w:type="dxa" w:w="80"/>
-            </w:tcMar>
-          </w:tcPr>
-          <w:p>
-            <w:r>
-              <w:rPr>
-                <w:rFonts w:ascii="Calibri" w:cs="Calibri" w:eastAsia="Calibri" w:hAnsi="Calibri"/>
-                <w:b w:val="false"/>
-                <w:bCs w:val="false"/>
-                <w:sz w:val="18"/>
-                <w:szCs w:val="18"/>
-              </w:rPr>
-              <w:t xml:space="preserve">Erase invites that were never accepted after a period (e.g. 90 days)</w:t>
+              <w:t xml:space="preserve">Invites are valid 7 days. One never accepted (expired, declined or revoked) is deleted — number and name — 30 days after it expired, by a daily job; the organization keeps only an anonymous count. Accepted invites are kept with the staff member's account.</w:t>
+            </w:r>
+          </w:p>
+        </w:tc>
+        <w:tc>
+          <w:tcPr>
+            <w:tcMar>
+              <w:top w:type="dxa" w:w="60"/>
+              <w:left w:type="dxa" w:w="80"/>
+              <w:bottom w:type="dxa" w:w="60"/>
+              <w:right w:type="dxa" w:w="80"/>
+            </w:tcMar>
+          </w:tcPr>
+          <w:p>
+            <w:r>
+              <w:rPr>
+                <w:rFonts w:ascii="Calibri" w:cs="Calibri" w:eastAsia="Calibri" w:hAnsi="Calibri"/>
+                <w:b w:val="false"/>
+                <w:bCs w:val="false"/>
+                <w:sz w:val="18"/>
+                <w:szCs w:val="18"/>
+              </w:rPr>
+              <w:t xml:space="preserve">Default pending counsel's answer to question 11</w:t>
             </w:r>
           </w:p>
         </w:tc>
@@ -7965,7 +7965,27 @@
           <w:sz w:val="21"/>
           <w:szCs w:val="21"/>
         </w:rPr>
-        <w:t xml:space="preserve"> An owner enters a person's name and mobile number to invite them, and we send that number an SMS. Is the owner's assurance enough, or do we need something more before contacting the person? How long may we keep invites that were never accepted?</w:t>
+        <w:t xml:space="preserve"> An owner enters a person's name and mobile number to invite them, and we send that number an SMS. Is the owner's assurance enough, or do we need something more before contacting the person? How long may we keep invites that were never accepted? </w:t>
+      </w:r>
+      <w:r>
+        <w:rPr>
+          <w:rFonts w:ascii="Calibri" w:cs="Calibri" w:eastAsia="Calibri" w:hAnsi="Calibri"/>
+          <w:b/>
+          <w:bCs/>
+          <w:sz w:val="21"/>
+          <w:szCs w:val="21"/>
+        </w:rPr>
+        <w:t xml:space="preserve">Default applied until you answer:</w:t>
+      </w:r>
+      <w:r>
+        <w:rPr>
+          <w:rFonts w:ascii="Calibri" w:cs="Calibri" w:eastAsia="Calibri" w:hAnsi="Calibri"/>
+          <w:b w:val="false"/>
+          <w:bCs w:val="false"/>
+          <w:sz w:val="21"/>
+          <w:szCs w:val="21"/>
+        </w:rPr>
+        <w:t xml:space="preserve"> the SMS contains only the organization's name and the app link, and invites not accepted within their 7-day validity are deleted (number and name) 30 days after they expire, keeping only an anonymous count for the organization's statistics. Please confirm or change.</w:t>
       </w:r>
     </w:p>
     <w:p>
@@ -8497,6 +8517,77 @@
                 <w:szCs w:val="18"/>
               </w:rPr>
               <w:t xml:space="preserve">Staff invites (number and name entered by the owner, SMS invitation) and staff records; what owners see about their staff; removal cuts access at once.</w:t>
+            </w:r>
+          </w:p>
+        </w:tc>
+      </w:tr>
+      <w:tr>
+        <w:trPr>
+          <w:tblHeader w:val="off"/>
+        </w:trPr>
+        <w:tc>
+          <w:tcPr>
+            <w:tcMar>
+              <w:top w:type="dxa" w:w="60"/>
+              <w:left w:type="dxa" w:w="80"/>
+              <w:bottom w:type="dxa" w:w="60"/>
+              <w:right w:type="dxa" w:w="80"/>
+            </w:tcMar>
+          </w:tcPr>
+          <w:p>
+            <w:r>
+              <w:rPr>
+                <w:rFonts w:ascii="Calibri" w:cs="Calibri" w:eastAsia="Calibri" w:hAnsi="Calibri"/>
+                <w:b w:val="false"/>
+                <w:bCs w:val="false"/>
+                <w:sz w:val="18"/>
+                <w:szCs w:val="18"/>
+              </w:rPr>
+              <w:t xml:space="preserve">8 Oct 2026</w:t>
+            </w:r>
+          </w:p>
+        </w:tc>
+        <w:tc>
+          <w:tcPr>
+            <w:tcMar>
+              <w:top w:type="dxa" w:w="60"/>
+              <w:left w:type="dxa" w:w="80"/>
+              <w:bottom w:type="dxa" w:w="60"/>
+              <w:right w:type="dxa" w:w="80"/>
+            </w:tcMar>
+          </w:tcPr>
+          <w:p>
+            <w:r>
+              <w:rPr>
+                <w:rFonts w:ascii="Calibri" w:cs="Calibri" w:eastAsia="Calibri" w:hAnsi="Calibri"/>
+                <w:b w:val="false"/>
+                <w:bCs w:val="false"/>
+                <w:sz w:val="18"/>
+                <w:szCs w:val="18"/>
+              </w:rPr>
+              <w:t xml:space="preserve">M3.2</w:t>
+            </w:r>
+          </w:p>
+        </w:tc>
+        <w:tc>
+          <w:tcPr>
+            <w:tcMar>
+              <w:top w:type="dxa" w:w="60"/>
+              <w:left w:type="dxa" w:w="80"/>
+              <w:bottom w:type="dxa" w:w="60"/>
+              <w:right w:type="dxa" w:w="80"/>
+            </w:tcMar>
+          </w:tcPr>
+          <w:p>
+            <w:r>
+              <w:rPr>
+                <w:rFonts w:ascii="Calibri" w:cs="Calibri" w:eastAsia="Calibri" w:hAnsi="Calibri"/>
+                <w:b w:val="false"/>
+                <w:bCs w:val="false"/>
+                <w:sz w:val="18"/>
+                <w:szCs w:val="18"/>
+              </w:rPr>
+              <w:t xml:space="preserve">Default for staff invites until question 11 is answered: SMS limited to the organization's name and the app link; never-accepted invites deleted 30 days after expiry, count only.</w:t>
             </w:r>
           </w:p>
         </w:tc>

</xml_diff>

<commit_message>
M3.5: admin sub-roles, analytics, segment broadcasts, Phase 3 exit test
- Admin roles super_admin / verifier / support / finance / marketing; one
  permission table keyed on route + method (unlisted = super_admin only),
  snapshot-tested; existing admins become super_admin. Booking notes and
  dispute descriptions only for super_admin and support.
- GET /admin/analytics: bookings, visits, GMV, revenue, cancellation rate,
  active providers, sign-ups by Cairo day / week / month, zero-filled.
- POST /admin/notifications/broadcast: marketing (promotions opt-out,
  3/day) and service announcements (super_admin, reason, always pushed,
  1/day); audience preview, audited, batched by a maintenance job, at most
  once per recipient (notification dedupeKey).
- Phase 3 exit test; data inventory, build plan, OpenAPI updated.

Co-Authored-By: Claude Opus 5.5 <noreply@anthropic.com>
</commit_message>
<xml_diff>
--- a/docs/DATA_INVENTORY.docx
+++ b/docs/DATA_INVENTORY.docx
@@ -3575,7 +3575,7 @@
                 <w:sz w:val="18"/>
                 <w:szCs w:val="18"/>
               </w:rPr>
-              <w:t xml:space="preserve">In-app messages about bookings, payments and the account</w:t>
+              <w:t xml:space="preserve">In-app messages about bookings, payments and the account; offers and service announcements from admin broadcasts (offers are pushed only to users with promotions on)</w:t>
             </w:r>
           </w:p>
         </w:tc>
@@ -3620,6 +3620,121 @@
                 <w:szCs w:val="18"/>
               </w:rPr>
               <w:t xml:space="preserve">No</w:t>
+            </w:r>
+          </w:p>
+        </w:tc>
+      </w:tr>
+      <w:tr>
+        <w:trPr>
+          <w:tblHeader w:val="off"/>
+        </w:trPr>
+        <w:tc>
+          <w:tcPr>
+            <w:tcMar>
+              <w:top w:type="dxa" w:w="60"/>
+              <w:left w:type="dxa" w:w="80"/>
+              <w:bottom w:type="dxa" w:w="60"/>
+              <w:right w:type="dxa" w:w="80"/>
+            </w:tcMar>
+          </w:tcPr>
+          <w:p>
+            <w:r>
+              <w:rPr>
+                <w:rFonts w:ascii="Calibri" w:cs="Calibri" w:eastAsia="Calibri" w:hAnsi="Calibri"/>
+                <w:b w:val="false"/>
+                <w:bCs w:val="false"/>
+                <w:sz w:val="18"/>
+                <w:szCs w:val="18"/>
+              </w:rPr>
+              <w:t xml:space="preserve">Broadcasts</w:t>
+            </w:r>
+          </w:p>
+        </w:tc>
+        <w:tc>
+          <w:tcPr>
+            <w:tcMar>
+              <w:top w:type="dxa" w:w="60"/>
+              <w:left w:type="dxa" w:w="80"/>
+              <w:bottom w:type="dxa" w:w="60"/>
+              <w:right w:type="dxa" w:w="80"/>
+            </w:tcMar>
+          </w:tcPr>
+          <w:p>
+            <w:r>
+              <w:rPr>
+                <w:rFonts w:ascii="Calibri" w:cs="Calibri" w:eastAsia="Calibri" w:hAnsi="Calibri"/>
+                <w:b w:val="false"/>
+                <w:bCs w:val="false"/>
+                <w:sz w:val="18"/>
+                <w:szCs w:val="18"/>
+              </w:rPr>
+              <w:t xml:space="preserve">Everyone (as recipients)</w:t>
+            </w:r>
+          </w:p>
+        </w:tc>
+        <w:tc>
+          <w:tcPr>
+            <w:tcMar>
+              <w:top w:type="dxa" w:w="60"/>
+              <w:left w:type="dxa" w:w="80"/>
+              <w:bottom w:type="dxa" w:w="60"/>
+              <w:right w:type="dxa" w:w="80"/>
+            </w:tcMar>
+          </w:tcPr>
+          <w:p>
+            <w:r>
+              <w:rPr>
+                <w:rFonts w:ascii="Calibri" w:cs="Calibri" w:eastAsia="Calibri" w:hAnsi="Calibri"/>
+                <w:b w:val="false"/>
+                <w:bCs w:val="false"/>
+                <w:sz w:val="18"/>
+                <w:szCs w:val="18"/>
+              </w:rPr>
+              <w:t xml:space="preserve">The message an admin sent, the segment (role, areas), who sent it, the reason (announcements), how many it reached; each recipient gets a normal in-app notification</w:t>
+            </w:r>
+          </w:p>
+        </w:tc>
+        <w:tc>
+          <w:tcPr>
+            <w:tcMar>
+              <w:top w:type="dxa" w:w="60"/>
+              <w:left w:type="dxa" w:w="80"/>
+              <w:bottom w:type="dxa" w:w="60"/>
+              <w:right w:type="dxa" w:w="80"/>
+            </w:tcMar>
+          </w:tcPr>
+          <w:p>
+            <w:r>
+              <w:rPr>
+                <w:rFonts w:ascii="Calibri" w:cs="Calibri" w:eastAsia="Calibri" w:hAnsi="Calibri"/>
+                <w:b w:val="false"/>
+                <w:bCs w:val="false"/>
+                <w:sz w:val="18"/>
+                <w:szCs w:val="18"/>
+              </w:rPr>
+              <w:t xml:space="preserve">Offers and service announcements</w:t>
+            </w:r>
+          </w:p>
+        </w:tc>
+        <w:tc>
+          <w:tcPr>
+            <w:tcMar>
+              <w:top w:type="dxa" w:w="60"/>
+              <w:left w:type="dxa" w:w="80"/>
+              <w:bottom w:type="dxa" w:w="60"/>
+              <w:right w:type="dxa" w:w="80"/>
+            </w:tcMar>
+          </w:tcPr>
+          <w:p>
+            <w:r>
+              <w:rPr>
+                <w:rFonts w:ascii="Calibri" w:cs="Calibri" w:eastAsia="Calibri" w:hAnsi="Calibri"/>
+                <w:b w:val="false"/>
+                <w:bCs w:val="false"/>
+                <w:sz w:val="18"/>
+                <w:szCs w:val="18"/>
+              </w:rPr>
+              <w:t xml:space="preserve">No (no list of recipients is stored)</w:t>
             </w:r>
           </w:p>
         </w:tc>
@@ -5215,7 +5330,7 @@
           <w:sz w:val="21"/>
           <w:szCs w:val="21"/>
         </w:rPr>
-        <w:t xml:space="preserve">Each person sees only their own data, providers see a patient's details only for their own bookings and only for a limited time, and admins see everything but every sensitive view is logged.</w:t>
+        <w:t xml:space="preserve">Each person sees only their own data, providers see a patient's details only for their own bookings and only for a limited time, and admins see what their admin role needs (super admins see everything), with every sensitive view logged.</w:t>
       </w:r>
     </w:p>
     <w:tbl>
@@ -6041,51 +6156,406 @@
                 <w:sz w:val="18"/>
                 <w:szCs w:val="18"/>
               </w:rPr>
-              <w:t xml:space="preserve">Reaya+ admin</w:t>
-            </w:r>
-          </w:p>
-        </w:tc>
-        <w:tc>
-          <w:tcPr>
-            <w:tcMar>
-              <w:top w:type="dxa" w:w="60"/>
-              <w:left w:type="dxa" w:w="80"/>
-              <w:bottom w:type="dxa" w:w="60"/>
-              <w:right w:type="dxa" w:w="80"/>
-            </w:tcMar>
-          </w:tcPr>
-          <w:p>
-            <w:r>
-              <w:rPr>
-                <w:rFonts w:ascii="Calibri" w:cs="Calibri" w:eastAsia="Calibri" w:hAnsi="Calibri"/>
-                <w:b w:val="false"/>
-                <w:bCs w:val="false"/>
-                <w:sz w:val="18"/>
-                <w:szCs w:val="18"/>
-              </w:rPr>
-              <w:t xml:space="preserve">All accounts, bookings, chats, disputes, provider and organization documents, payments, payouts of providers and organizations (with the full payout account number in the payout queue), plans, each patient's cancellation record, package sales and promo use counts, organizations' commission rates</w:t>
-            </w:r>
-          </w:p>
-        </w:tc>
-        <w:tc>
-          <w:tcPr>
-            <w:tcMar>
-              <w:top w:type="dxa" w:w="60"/>
-              <w:left w:type="dxa" w:w="80"/>
-              <w:bottom w:type="dxa" w:w="60"/>
-              <w:right w:type="dxa" w:w="80"/>
-            </w:tcMar>
-          </w:tcPr>
-          <w:p>
-            <w:r>
-              <w:rPr>
-                <w:rFonts w:ascii="Calibri" w:cs="Calibri" w:eastAsia="Calibri" w:hAnsi="Calibri"/>
-                <w:b w:val="false"/>
-                <w:bCs w:val="false"/>
-                <w:sz w:val="18"/>
-                <w:szCs w:val="18"/>
-              </w:rPr>
-              <w:t xml:space="preserve">Every action logged; viewing booking notes, dispute descriptions or a booking's chats (including closed ones) is logged; admin roles with narrower access are planned but not yet defined</w:t>
+              <w:t xml:space="preserve">Reaya+ admin — every role</w:t>
+            </w:r>
+          </w:p>
+        </w:tc>
+        <w:tc>
+          <w:tcPr>
+            <w:tcMar>
+              <w:top w:type="dxa" w:w="60"/>
+              <w:left w:type="dxa" w:w="80"/>
+              <w:bottom w:type="dxa" w:w="60"/>
+              <w:right w:type="dxa" w:w="80"/>
+            </w:tcMar>
+          </w:tcPr>
+          <w:p>
+            <w:r>
+              <w:rPr>
+                <w:rFonts w:ascii="Calibri" w:cs="Calibri" w:eastAsia="Calibri" w:hAnsi="Calibri"/>
+                <w:b w:val="false"/>
+                <w:bCs w:val="false"/>
+                <w:sz w:val="18"/>
+                <w:szCs w:val="18"/>
+              </w:rPr>
+              <w:t xml:space="preserve">Dashboard and analytics (counts and totals only, no names), the lists of services and areas</w:t>
+            </w:r>
+          </w:p>
+        </w:tc>
+        <w:tc>
+          <w:tcPr>
+            <w:tcMar>
+              <w:top w:type="dxa" w:w="60"/>
+              <w:left w:type="dxa" w:w="80"/>
+              <w:bottom w:type="dxa" w:w="60"/>
+              <w:right w:type="dxa" w:w="80"/>
+            </w:tcMar>
+          </w:tcPr>
+          <w:p>
+            <w:r>
+              <w:rPr>
+                <w:rFonts w:ascii="Calibri" w:cs="Calibri" w:eastAsia="Calibri" w:hAnsi="Calibri"/>
+                <w:b w:val="false"/>
+                <w:bCs w:val="false"/>
+                <w:sz w:val="18"/>
+                <w:szCs w:val="18"/>
+              </w:rPr>
+              <w:t xml:space="preserve">Every action logged</w:t>
+            </w:r>
+          </w:p>
+        </w:tc>
+      </w:tr>
+      <w:tr>
+        <w:trPr>
+          <w:tblHeader w:val="off"/>
+        </w:trPr>
+        <w:tc>
+          <w:tcPr>
+            <w:tcMar>
+              <w:top w:type="dxa" w:w="60"/>
+              <w:left w:type="dxa" w:w="80"/>
+              <w:bottom w:type="dxa" w:w="60"/>
+              <w:right w:type="dxa" w:w="80"/>
+            </w:tcMar>
+          </w:tcPr>
+          <w:p>
+            <w:r>
+              <w:rPr>
+                <w:rFonts w:ascii="Calibri" w:cs="Calibri" w:eastAsia="Calibri" w:hAnsi="Calibri"/>
+                <w:b w:val="false"/>
+                <w:bCs w:val="false"/>
+                <w:sz w:val="18"/>
+                <w:szCs w:val="18"/>
+              </w:rPr>
+              <w:t xml:space="preserve">Super admin</w:t>
+            </w:r>
+          </w:p>
+        </w:tc>
+        <w:tc>
+          <w:tcPr>
+            <w:tcMar>
+              <w:top w:type="dxa" w:w="60"/>
+              <w:left w:type="dxa" w:w="80"/>
+              <w:bottom w:type="dxa" w:w="60"/>
+              <w:right w:type="dxa" w:w="80"/>
+            </w:tcMar>
+          </w:tcPr>
+          <w:p>
+            <w:r>
+              <w:rPr>
+                <w:rFonts w:ascii="Calibri" w:cs="Calibri" w:eastAsia="Calibri" w:hAnsi="Calibri"/>
+                <w:b w:val="false"/>
+                <w:bCs w:val="false"/>
+                <w:sz w:val="18"/>
+                <w:szCs w:val="18"/>
+              </w:rPr>
+              <w:t xml:space="preserve">Everything below, plus admin accounts, settings, the audit log, plans and the service catalog; service announcements to all users</w:t>
+            </w:r>
+          </w:p>
+        </w:tc>
+        <w:tc>
+          <w:tcPr>
+            <w:tcMar>
+              <w:top w:type="dxa" w:w="60"/>
+              <w:left w:type="dxa" w:w="80"/>
+              <w:bottom w:type="dxa" w:w="60"/>
+              <w:right w:type="dxa" w:w="80"/>
+            </w:tcMar>
+          </w:tcPr>
+          <w:p>
+            <w:r>
+              <w:rPr>
+                <w:rFonts w:ascii="Calibri" w:cs="Calibri" w:eastAsia="Calibri" w:hAnsi="Calibri"/>
+                <w:b w:val="false"/>
+                <w:bCs w:val="false"/>
+                <w:sz w:val="18"/>
+                <w:szCs w:val="18"/>
+              </w:rPr>
+              <w:t xml:space="preserve">Every action logged; viewing booking notes, dispute descriptions or a booking's chats (including closed ones) is logged</w:t>
+            </w:r>
+          </w:p>
+        </w:tc>
+      </w:tr>
+      <w:tr>
+        <w:trPr>
+          <w:tblHeader w:val="off"/>
+        </w:trPr>
+        <w:tc>
+          <w:tcPr>
+            <w:tcMar>
+              <w:top w:type="dxa" w:w="60"/>
+              <w:left w:type="dxa" w:w="80"/>
+              <w:bottom w:type="dxa" w:w="60"/>
+              <w:right w:type="dxa" w:w="80"/>
+            </w:tcMar>
+          </w:tcPr>
+          <w:p>
+            <w:r>
+              <w:rPr>
+                <w:rFonts w:ascii="Calibri" w:cs="Calibri" w:eastAsia="Calibri" w:hAnsi="Calibri"/>
+                <w:b w:val="false"/>
+                <w:bCs w:val="false"/>
+                <w:sz w:val="18"/>
+                <w:szCs w:val="18"/>
+              </w:rPr>
+              <w:t xml:space="preserve">Verifier admin</w:t>
+            </w:r>
+          </w:p>
+        </w:tc>
+        <w:tc>
+          <w:tcPr>
+            <w:tcMar>
+              <w:top w:type="dxa" w:w="60"/>
+              <w:left w:type="dxa" w:w="80"/>
+              <w:bottom w:type="dxa" w:w="60"/>
+              <w:right w:type="dxa" w:w="80"/>
+            </w:tcMar>
+          </w:tcPr>
+          <w:p>
+            <w:r>
+              <w:rPr>
+                <w:rFonts w:ascii="Calibri" w:cs="Calibri" w:eastAsia="Calibri" w:hAnsi="Calibri"/>
+                <w:b w:val="false"/>
+                <w:bCs w:val="false"/>
+                <w:sz w:val="18"/>
+                <w:szCs w:val="18"/>
+              </w:rPr>
+              <w:t xml:space="preserve">Verification queue: provider and organization identity documents and licences; provider, organization and user records (read); can suspend a provider's listing</w:t>
+            </w:r>
+          </w:p>
+        </w:tc>
+        <w:tc>
+          <w:tcPr>
+            <w:tcMar>
+              <w:top w:type="dxa" w:w="60"/>
+              <w:left w:type="dxa" w:w="80"/>
+              <w:bottom w:type="dxa" w:w="60"/>
+              <w:right w:type="dxa" w:w="80"/>
+            </w:tcMar>
+          </w:tcPr>
+          <w:p>
+            <w:r>
+              <w:rPr>
+                <w:rFonts w:ascii="Calibri" w:cs="Calibri" w:eastAsia="Calibri" w:hAnsi="Calibri"/>
+                <w:b w:val="false"/>
+                <w:bCs w:val="false"/>
+                <w:sz w:val="18"/>
+                <w:szCs w:val="18"/>
+              </w:rPr>
+              <w:t xml:space="preserve">Every action logged; no payments, payouts, chats, booking notes or dispute descriptions</w:t>
+            </w:r>
+          </w:p>
+        </w:tc>
+      </w:tr>
+      <w:tr>
+        <w:trPr>
+          <w:tblHeader w:val="off"/>
+        </w:trPr>
+        <w:tc>
+          <w:tcPr>
+            <w:tcMar>
+              <w:top w:type="dxa" w:w="60"/>
+              <w:left w:type="dxa" w:w="80"/>
+              <w:bottom w:type="dxa" w:w="60"/>
+              <w:right w:type="dxa" w:w="80"/>
+            </w:tcMar>
+          </w:tcPr>
+          <w:p>
+            <w:r>
+              <w:rPr>
+                <w:rFonts w:ascii="Calibri" w:cs="Calibri" w:eastAsia="Calibri" w:hAnsi="Calibri"/>
+                <w:b w:val="false"/>
+                <w:bCs w:val="false"/>
+                <w:sz w:val="18"/>
+                <w:szCs w:val="18"/>
+              </w:rPr>
+              <w:t xml:space="preserve">Support admin</w:t>
+            </w:r>
+          </w:p>
+        </w:tc>
+        <w:tc>
+          <w:tcPr>
+            <w:tcMar>
+              <w:top w:type="dxa" w:w="60"/>
+              <w:left w:type="dxa" w:w="80"/>
+              <w:bottom w:type="dxa" w:w="60"/>
+              <w:right w:type="dxa" w:w="80"/>
+            </w:tcMar>
+          </w:tcPr>
+          <w:p>
+            <w:r>
+              <w:rPr>
+                <w:rFonts w:ascii="Calibri" w:cs="Calibri" w:eastAsia="Calibri" w:hAnsi="Calibri"/>
+                <w:b w:val="false"/>
+                <w:bCs w:val="false"/>
+                <w:sz w:val="18"/>
+                <w:szCs w:val="18"/>
+              </w:rPr>
+              <w:t xml:space="preserve">Users (suspend, warn), bookings with their notes, a booking's chats (including closed ones), disputes with their descriptions, reviews</w:t>
+            </w:r>
+          </w:p>
+        </w:tc>
+        <w:tc>
+          <w:tcPr>
+            <w:tcMar>
+              <w:top w:type="dxa" w:w="60"/>
+              <w:left w:type="dxa" w:w="80"/>
+              <w:bottom w:type="dxa" w:w="60"/>
+              <w:right w:type="dxa" w:w="80"/>
+            </w:tcMar>
+          </w:tcPr>
+          <w:p>
+            <w:r>
+              <w:rPr>
+                <w:rFonts w:ascii="Calibri" w:cs="Calibri" w:eastAsia="Calibri" w:hAnsi="Calibri"/>
+                <w:b w:val="false"/>
+                <w:bCs w:val="false"/>
+                <w:sz w:val="18"/>
+                <w:szCs w:val="18"/>
+              </w:rPr>
+              <w:t xml:space="preserve">Every action logged; viewing notes, dispute descriptions or chats is logged; no payments or payouts</w:t>
+            </w:r>
+          </w:p>
+        </w:tc>
+      </w:tr>
+      <w:tr>
+        <w:trPr>
+          <w:tblHeader w:val="off"/>
+        </w:trPr>
+        <w:tc>
+          <w:tcPr>
+            <w:tcMar>
+              <w:top w:type="dxa" w:w="60"/>
+              <w:left w:type="dxa" w:w="80"/>
+              <w:bottom w:type="dxa" w:w="60"/>
+              <w:right w:type="dxa" w:w="80"/>
+            </w:tcMar>
+          </w:tcPr>
+          <w:p>
+            <w:r>
+              <w:rPr>
+                <w:rFonts w:ascii="Calibri" w:cs="Calibri" w:eastAsia="Calibri" w:hAnsi="Calibri"/>
+                <w:b w:val="false"/>
+                <w:bCs w:val="false"/>
+                <w:sz w:val="18"/>
+                <w:szCs w:val="18"/>
+              </w:rPr>
+              <w:t xml:space="preserve">Finance admin</w:t>
+            </w:r>
+          </w:p>
+        </w:tc>
+        <w:tc>
+          <w:tcPr>
+            <w:tcMar>
+              <w:top w:type="dxa" w:w="60"/>
+              <w:left w:type="dxa" w:w="80"/>
+              <w:bottom w:type="dxa" w:w="60"/>
+              <w:right w:type="dxa" w:w="80"/>
+            </w:tcMar>
+          </w:tcPr>
+          <w:p>
+            <w:r>
+              <w:rPr>
+                <w:rFonts w:ascii="Calibri" w:cs="Calibri" w:eastAsia="Calibri" w:hAnsi="Calibri"/>
+                <w:b w:val="false"/>
+                <w:bCs w:val="false"/>
+                <w:sz w:val="18"/>
+                <w:szCs w:val="18"/>
+              </w:rPr>
+              <w:t xml:space="preserve">Payments, refunds, payouts of providers and organizations (with the full payout account number in the payout queue), commission dues, ledger adjustments, financial exports, organizations' commission rates, bookings and disputes for money questions</w:t>
+            </w:r>
+          </w:p>
+        </w:tc>
+        <w:tc>
+          <w:tcPr>
+            <w:tcMar>
+              <w:top w:type="dxa" w:w="60"/>
+              <w:left w:type="dxa" w:w="80"/>
+              <w:bottom w:type="dxa" w:w="60"/>
+              <w:right w:type="dxa" w:w="80"/>
+            </w:tcMar>
+          </w:tcPr>
+          <w:p>
+            <w:r>
+              <w:rPr>
+                <w:rFonts w:ascii="Calibri" w:cs="Calibri" w:eastAsia="Calibri" w:hAnsi="Calibri"/>
+                <w:b w:val="false"/>
+                <w:bCs w:val="false"/>
+                <w:sz w:val="18"/>
+                <w:szCs w:val="18"/>
+              </w:rPr>
+              <w:t xml:space="preserve">Every action logged; booking notes and dispute descriptions are hidden from this role; no chats</w:t>
+            </w:r>
+          </w:p>
+        </w:tc>
+      </w:tr>
+      <w:tr>
+        <w:trPr>
+          <w:tblHeader w:val="off"/>
+        </w:trPr>
+        <w:tc>
+          <w:tcPr>
+            <w:tcMar>
+              <w:top w:type="dxa" w:w="60"/>
+              <w:left w:type="dxa" w:w="80"/>
+              <w:bottom w:type="dxa" w:w="60"/>
+              <w:right w:type="dxa" w:w="80"/>
+            </w:tcMar>
+          </w:tcPr>
+          <w:p>
+            <w:r>
+              <w:rPr>
+                <w:rFonts w:ascii="Calibri" w:cs="Calibri" w:eastAsia="Calibri" w:hAnsi="Calibri"/>
+                <w:b w:val="false"/>
+                <w:bCs w:val="false"/>
+                <w:sz w:val="18"/>
+                <w:szCs w:val="18"/>
+              </w:rPr>
+              <w:t xml:space="preserve">Marketing admin</w:t>
+            </w:r>
+          </w:p>
+        </w:tc>
+        <w:tc>
+          <w:tcPr>
+            <w:tcMar>
+              <w:top w:type="dxa" w:w="60"/>
+              <w:left w:type="dxa" w:w="80"/>
+              <w:bottom w:type="dxa" w:w="60"/>
+              <w:right w:type="dxa" w:w="80"/>
+            </w:tcMar>
+          </w:tcPr>
+          <w:p>
+            <w:r>
+              <w:rPr>
+                <w:rFonts w:ascii="Calibri" w:cs="Calibri" w:eastAsia="Calibri" w:hAnsi="Calibri"/>
+                <w:b w:val="false"/>
+                <w:bCs w:val="false"/>
+                <w:sz w:val="18"/>
+                <w:szCs w:val="18"/>
+              </w:rPr>
+              <w:t xml:space="preserve">Promo codes, banners, packages and plan list; marketing broadcasts to a segment (by role and area) with the audience size</w:t>
+            </w:r>
+          </w:p>
+        </w:tc>
+        <w:tc>
+          <w:tcPr>
+            <w:tcMar>
+              <w:top w:type="dxa" w:w="60"/>
+              <w:left w:type="dxa" w:w="80"/>
+              <w:bottom w:type="dxa" w:w="60"/>
+              <w:right w:type="dxa" w:w="80"/>
+            </w:tcMar>
+          </w:tcPr>
+          <w:p>
+            <w:r>
+              <w:rPr>
+                <w:rFonts w:ascii="Calibri" w:cs="Calibri" w:eastAsia="Calibri" w:hAnsi="Calibri"/>
+                <w:b w:val="false"/>
+                <w:bCs w:val="false"/>
+                <w:sz w:val="18"/>
+                <w:szCs w:val="18"/>
+              </w:rPr>
+              <w:t xml:space="preserve">Every action logged; sees counts only, never who is in a segment; no bookings, users or payments</w:t>
             </w:r>
           </w:p>
         </w:tc>
@@ -9058,6 +9528,77 @@
                 <w:szCs w:val="18"/>
               </w:rPr>
               <w:t xml:space="preserve">Unpaid plan fees are tracked per month (no personal data); an organization unpaid for 21 days is moved to the free plan.</w:t>
+            </w:r>
+          </w:p>
+        </w:tc>
+      </w:tr>
+      <w:tr>
+        <w:trPr>
+          <w:tblHeader w:val="off"/>
+        </w:trPr>
+        <w:tc>
+          <w:tcPr>
+            <w:tcMar>
+              <w:top w:type="dxa" w:w="60"/>
+              <w:left w:type="dxa" w:w="80"/>
+              <w:bottom w:type="dxa" w:w="60"/>
+              <w:right w:type="dxa" w:w="80"/>
+            </w:tcMar>
+          </w:tcPr>
+          <w:p>
+            <w:r>
+              <w:rPr>
+                <w:rFonts w:ascii="Calibri" w:cs="Calibri" w:eastAsia="Calibri" w:hAnsi="Calibri"/>
+                <w:b w:val="false"/>
+                <w:bCs w:val="false"/>
+                <w:sz w:val="18"/>
+                <w:szCs w:val="18"/>
+              </w:rPr>
+              <w:t xml:space="preserve">8 Oct 2026</w:t>
+            </w:r>
+          </w:p>
+        </w:tc>
+        <w:tc>
+          <w:tcPr>
+            <w:tcMar>
+              <w:top w:type="dxa" w:w="60"/>
+              <w:left w:type="dxa" w:w="80"/>
+              <w:bottom w:type="dxa" w:w="60"/>
+              <w:right w:type="dxa" w:w="80"/>
+            </w:tcMar>
+          </w:tcPr>
+          <w:p>
+            <w:r>
+              <w:rPr>
+                <w:rFonts w:ascii="Calibri" w:cs="Calibri" w:eastAsia="Calibri" w:hAnsi="Calibri"/>
+                <w:b w:val="false"/>
+                <w:bCs w:val="false"/>
+                <w:sz w:val="18"/>
+                <w:szCs w:val="18"/>
+              </w:rPr>
+              <w:t xml:space="preserve">M3.5</w:t>
+            </w:r>
+          </w:p>
+        </w:tc>
+        <w:tc>
+          <w:tcPr>
+            <w:tcMar>
+              <w:top w:type="dxa" w:w="60"/>
+              <w:left w:type="dxa" w:w="80"/>
+              <w:bottom w:type="dxa" w:w="60"/>
+              <w:right w:type="dxa" w:w="80"/>
+            </w:tcMar>
+          </w:tcPr>
+          <w:p>
+            <w:r>
+              <w:rPr>
+                <w:rFonts w:ascii="Calibri" w:cs="Calibri" w:eastAsia="Calibri" w:hAnsi="Calibri"/>
+                <w:b w:val="false"/>
+                <w:bCs w:val="false"/>
+                <w:sz w:val="18"/>
+                <w:szCs w:val="18"/>
+              </w:rPr>
+              <w:t xml:space="preserve">Admin roles (super admin, verifier, support, finance, marketing) with narrower access — booking notes and dispute descriptions only for super admin and support; admin analytics (aggregates only); broadcasts (marketing ones respect the promotions setting; service announcements always reach everyone, super admin only, with a reason).</w:t>
             </w:r>
           </w:p>
         </w:tc>

</xml_diff>

<commit_message>
Launch prep: test numbers, account-deletion page, consent records
- Test numbers: allowlisted numbers (TEST_PHONE_NUMBERS) sign in with
  TEST_OTP_CODE instead of an SMS; every issue and use audited. In
  production the fixed code never opens a real account or an admin, and
  test accounts only find and book test providers / organizations (search,
  quotes, fallback offers); analytics leave them out.
- Account-deletion web page (GET /api/v1/account-deletion) for Google
  Play: SMS code, then the same DELETE /me as the app.
- Consent: versioned terms / privacy / health-data texts published by a
  super admin (append-only); sign-up requires the current ones once
  published; GET/POST /me/consents; append-only records with time and IP.
- SECURITY.md: admin roles closed, new controls and open items; data
  inventory, build plan, OpenAPI updated.

Co-Authored-By: Claude Opus 5.5 <noreply@anthropic.com>
</commit_message>
<xml_diff>
--- a/docs/DATA_INVENTORY.docx
+++ b/docs/DATA_INVENTORY.docx
@@ -3969,6 +3969,236 @@
           </w:p>
         </w:tc>
       </w:tr>
+      <w:tr>
+        <w:trPr>
+          <w:tblHeader w:val="off"/>
+        </w:trPr>
+        <w:tc>
+          <w:tcPr>
+            <w:tcMar>
+              <w:top w:type="dxa" w:w="60"/>
+              <w:left w:type="dxa" w:w="80"/>
+              <w:bottom w:type="dxa" w:w="60"/>
+              <w:right w:type="dxa" w:w="80"/>
+            </w:tcMar>
+          </w:tcPr>
+          <w:p>
+            <w:r>
+              <w:rPr>
+                <w:rFonts w:ascii="Calibri" w:cs="Calibri" w:eastAsia="Calibri" w:hAnsi="Calibri"/>
+                <w:b w:val="false"/>
+                <w:bCs w:val="false"/>
+                <w:sz w:val="18"/>
+                <w:szCs w:val="18"/>
+              </w:rPr>
+              <w:t xml:space="preserve">Consent records</w:t>
+            </w:r>
+          </w:p>
+        </w:tc>
+        <w:tc>
+          <w:tcPr>
+            <w:tcMar>
+              <w:top w:type="dxa" w:w="60"/>
+              <w:left w:type="dxa" w:w="80"/>
+              <w:bottom w:type="dxa" w:w="60"/>
+              <w:right w:type="dxa" w:w="80"/>
+            </w:tcMar>
+          </w:tcPr>
+          <w:p>
+            <w:r>
+              <w:rPr>
+                <w:rFonts w:ascii="Calibri" w:cs="Calibri" w:eastAsia="Calibri" w:hAnsi="Calibri"/>
+                <w:b w:val="false"/>
+                <w:bCs w:val="false"/>
+                <w:sz w:val="18"/>
+                <w:szCs w:val="18"/>
+              </w:rPr>
+              <w:t xml:space="preserve">Everyone who signs up</w:t>
+            </w:r>
+          </w:p>
+        </w:tc>
+        <w:tc>
+          <w:tcPr>
+            <w:tcMar>
+              <w:top w:type="dxa" w:w="60"/>
+              <w:left w:type="dxa" w:w="80"/>
+              <w:bottom w:type="dxa" w:w="60"/>
+              <w:right w:type="dxa" w:w="80"/>
+            </w:tcMar>
+          </w:tcPr>
+          <w:p>
+            <w:r>
+              <w:rPr>
+                <w:rFonts w:ascii="Calibri" w:cs="Calibri" w:eastAsia="Calibri" w:hAnsi="Calibri"/>
+                <w:b w:val="false"/>
+                <w:bCs w:val="false"/>
+                <w:sz w:val="18"/>
+                <w:szCs w:val="18"/>
+              </w:rPr>
+              <w:t xml:space="preserve">Which version of the terms, privacy notice and health-data consent the person accepted or withdrew, when, and from which IP</w:t>
+            </w:r>
+          </w:p>
+        </w:tc>
+        <w:tc>
+          <w:tcPr>
+            <w:tcMar>
+              <w:top w:type="dxa" w:w="60"/>
+              <w:left w:type="dxa" w:w="80"/>
+              <w:bottom w:type="dxa" w:w="60"/>
+              <w:right w:type="dxa" w:w="80"/>
+            </w:tcMar>
+          </w:tcPr>
+          <w:p>
+            <w:r>
+              <w:rPr>
+                <w:rFonts w:ascii="Calibri" w:cs="Calibri" w:eastAsia="Calibri" w:hAnsi="Calibri"/>
+                <w:b w:val="false"/>
+                <w:bCs w:val="false"/>
+                <w:sz w:val="18"/>
+                <w:szCs w:val="18"/>
+              </w:rPr>
+              <w:t xml:space="preserve">Proof of explicit consent to process health data</w:t>
+            </w:r>
+          </w:p>
+        </w:tc>
+        <w:tc>
+          <w:tcPr>
+            <w:tcMar>
+              <w:top w:type="dxa" w:w="60"/>
+              <w:left w:type="dxa" w:w="80"/>
+              <w:bottom w:type="dxa" w:w="60"/>
+              <w:right w:type="dxa" w:w="80"/>
+            </w:tcMar>
+          </w:tcPr>
+          <w:p>
+            <w:r>
+              <w:rPr>
+                <w:rFonts w:ascii="Calibri" w:cs="Calibri" w:eastAsia="Calibri" w:hAnsi="Calibri"/>
+                <w:b w:val="false"/>
+                <w:bCs w:val="false"/>
+                <w:sz w:val="18"/>
+                <w:szCs w:val="18"/>
+              </w:rPr>
+              <w:t xml:space="preserve">No (it records consent to sensitive data, not the data)</w:t>
+            </w:r>
+          </w:p>
+        </w:tc>
+      </w:tr>
+      <w:tr>
+        <w:trPr>
+          <w:tblHeader w:val="off"/>
+        </w:trPr>
+        <w:tc>
+          <w:tcPr>
+            <w:tcMar>
+              <w:top w:type="dxa" w:w="60"/>
+              <w:left w:type="dxa" w:w="80"/>
+              <w:bottom w:type="dxa" w:w="60"/>
+              <w:right w:type="dxa" w:w="80"/>
+            </w:tcMar>
+          </w:tcPr>
+          <w:p>
+            <w:r>
+              <w:rPr>
+                <w:rFonts w:ascii="Calibri" w:cs="Calibri" w:eastAsia="Calibri" w:hAnsi="Calibri"/>
+                <w:b w:val="false"/>
+                <w:bCs w:val="false"/>
+                <w:sz w:val="18"/>
+                <w:szCs w:val="18"/>
+              </w:rPr>
+              <w:t xml:space="preserve">Test accounts</w:t>
+            </w:r>
+          </w:p>
+        </w:tc>
+        <w:tc>
+          <w:tcPr>
+            <w:tcMar>
+              <w:top w:type="dxa" w:w="60"/>
+              <w:left w:type="dxa" w:w="80"/>
+              <w:bottom w:type="dxa" w:w="60"/>
+              <w:right w:type="dxa" w:w="80"/>
+            </w:tcMar>
+          </w:tcPr>
+          <w:p>
+            <w:r>
+              <w:rPr>
+                <w:rFonts w:ascii="Calibri" w:cs="Calibri" w:eastAsia="Calibri" w:hAnsi="Calibri"/>
+                <w:b w:val="false"/>
+                <w:bCs w:val="false"/>
+                <w:sz w:val="18"/>
+                <w:szCs w:val="18"/>
+              </w:rPr>
+              <w:t xml:space="preserve">Our own testers and app-store reviewers</w:t>
+            </w:r>
+          </w:p>
+        </w:tc>
+        <w:tc>
+          <w:tcPr>
+            <w:tcMar>
+              <w:top w:type="dxa" w:w="60"/>
+              <w:left w:type="dxa" w:w="80"/>
+              <w:bottom w:type="dxa" w:w="60"/>
+              <w:right w:type="dxa" w:w="80"/>
+            </w:tcMar>
+          </w:tcPr>
+          <w:p>
+            <w:r>
+              <w:rPr>
+                <w:rFonts w:ascii="Calibri" w:cs="Calibri" w:eastAsia="Calibri" w:hAnsi="Calibri"/>
+                <w:b w:val="false"/>
+                <w:bCs w:val="false"/>
+                <w:sz w:val="18"/>
+                <w:szCs w:val="18"/>
+              </w:rPr>
+              <w:t xml:space="preserve">A flag on accounts created with our test numbers, which sign in with a fixed code instead of an SMS; each use is logged</w:t>
+            </w:r>
+          </w:p>
+        </w:tc>
+        <w:tc>
+          <w:tcPr>
+            <w:tcMar>
+              <w:top w:type="dxa" w:w="60"/>
+              <w:left w:type="dxa" w:w="80"/>
+              <w:bottom w:type="dxa" w:w="60"/>
+              <w:right w:type="dxa" w:w="80"/>
+            </w:tcMar>
+          </w:tcPr>
+          <w:p>
+            <w:r>
+              <w:rPr>
+                <w:rFonts w:ascii="Calibri" w:cs="Calibri" w:eastAsia="Calibri" w:hAnsi="Calibri"/>
+                <w:b w:val="false"/>
+                <w:bCs w:val="false"/>
+                <w:sz w:val="18"/>
+                <w:szCs w:val="18"/>
+              </w:rPr>
+              <w:t xml:space="preserve">Store review and testing without real SMS; test accounts never meet real users in production</w:t>
+            </w:r>
+          </w:p>
+        </w:tc>
+        <w:tc>
+          <w:tcPr>
+            <w:tcMar>
+              <w:top w:type="dxa" w:w="60"/>
+              <w:left w:type="dxa" w:w="80"/>
+              <w:bottom w:type="dxa" w:w="60"/>
+              <w:right w:type="dxa" w:w="80"/>
+            </w:tcMar>
+          </w:tcPr>
+          <w:p>
+            <w:r>
+              <w:rPr>
+                <w:rFonts w:ascii="Calibri" w:cs="Calibri" w:eastAsia="Calibri" w:hAnsi="Calibri"/>
+                <w:b w:val="false"/>
+                <w:bCs w:val="false"/>
+                <w:sz w:val="18"/>
+                <w:szCs w:val="18"/>
+              </w:rPr>
+              <w:t xml:space="preserve">No</w:t>
+            </w:r>
+          </w:p>
+        </w:tc>
+      </w:tr>
     </w:tbl>
     <w:p/>
     <w:p>
@@ -8197,6 +8427,77 @@
                 <w:sz w:val="18"/>
                 <w:szCs w:val="18"/>
               </w:rPr>
+              <w:t xml:space="preserve">Consent records and published consent texts</w:t>
+            </w:r>
+          </w:p>
+        </w:tc>
+        <w:tc>
+          <w:tcPr>
+            <w:tcMar>
+              <w:top w:type="dxa" w:w="60"/>
+              <w:left w:type="dxa" w:w="80"/>
+              <w:bottom w:type="dxa" w:w="60"/>
+              <w:right w:type="dxa" w:w="80"/>
+            </w:tcMar>
+          </w:tcPr>
+          <w:p>
+            <w:r>
+              <w:rPr>
+                <w:rFonts w:ascii="Calibri" w:cs="Calibri" w:eastAsia="Calibri" w:hAnsi="Calibri"/>
+                <w:b w:val="false"/>
+                <w:bCs w:val="false"/>
+                <w:sz w:val="18"/>
+                <w:szCs w:val="18"/>
+              </w:rPr>
+              <w:t xml:space="preserve">Kept; cannot be edited (evidence of consent)</w:t>
+            </w:r>
+          </w:p>
+        </w:tc>
+        <w:tc>
+          <w:tcPr>
+            <w:tcMar>
+              <w:top w:type="dxa" w:w="60"/>
+              <w:left w:type="dxa" w:w="80"/>
+              <w:bottom w:type="dxa" w:w="60"/>
+              <w:right w:type="dxa" w:w="80"/>
+            </w:tcMar>
+          </w:tcPr>
+          <w:p>
+            <w:r>
+              <w:rPr>
+                <w:rFonts w:ascii="Calibri" w:cs="Calibri" w:eastAsia="Calibri" w:hAnsi="Calibri"/>
+                <w:b w:val="false"/>
+                <w:bCs w:val="false"/>
+                <w:sz w:val="18"/>
+                <w:szCs w:val="18"/>
+              </w:rPr>
+              <w:t xml:space="preserve">Retention period after the account closes</w:t>
+            </w:r>
+          </w:p>
+        </w:tc>
+      </w:tr>
+      <w:tr>
+        <w:trPr>
+          <w:tblHeader w:val="off"/>
+        </w:trPr>
+        <w:tc>
+          <w:tcPr>
+            <w:tcMar>
+              <w:top w:type="dxa" w:w="60"/>
+              <w:left w:type="dxa" w:w="80"/>
+              <w:bottom w:type="dxa" w:w="60"/>
+              <w:right w:type="dxa" w:w="80"/>
+            </w:tcMar>
+          </w:tcPr>
+          <w:p>
+            <w:r>
+              <w:rPr>
+                <w:rFonts w:ascii="Calibri" w:cs="Calibri" w:eastAsia="Calibri" w:hAnsi="Calibri"/>
+                <w:b w:val="false"/>
+                <w:bCs w:val="false"/>
+                <w:sz w:val="18"/>
+                <w:szCs w:val="18"/>
+              </w:rPr>
               <w:t xml:space="preserve">Backups</w:t>
             </w:r>
           </w:p>
@@ -8331,7 +8632,7 @@
           <w:sz w:val="21"/>
           <w:szCs w:val="21"/>
         </w:rPr>
-        <w:t xml:space="preserve">An account cannot be closed while it has an active booking. Closing an account does not delete visit reports already given to the patient's record.</w:t>
+        <w:t xml:space="preserve">An account cannot be closed while it has an active booking. Closing an account does not delete visit reports already given to the patient's record. People can close their account in the app or on a web page (required by Google Play) that confirms the number by SMS code and applies the same rules.</w:t>
       </w:r>
     </w:p>
     <w:p>
@@ -8452,7 +8753,7 @@
           <w:sz w:val="21"/>
           <w:szCs w:val="21"/>
         </w:rPr>
-        <w:t xml:space="preserve"> What consent must patients give for their health data, and in what wording (Arabic)? A patient also enters data about family members: what consent is needed from them, and from guardians for children?</w:t>
+        <w:t xml:space="preserve"> What consent must patients give for their health data, and in what wording (Arabic)? (The app is ready to record it: send the texts for the terms, the privacy notice and the health-data consent, and we publish them as version 1; sign-up then requires them, and later changes ask everyone again.) A patient also enters data about family members: what consent is needed from them, and from guardians for children?</w:t>
       </w:r>
     </w:p>
     <w:p>
@@ -9599,6 +9900,77 @@
                 <w:szCs w:val="18"/>
               </w:rPr>
               <w:t xml:space="preserve">Admin roles (super admin, verifier, support, finance, marketing) with narrower access — booking notes and dispute descriptions only for super admin and support; admin analytics (aggregates only); broadcasts (marketing ones respect the promotions setting; service announcements always reach everyone, super admin only, with a reason).</w:t>
+            </w:r>
+          </w:p>
+        </w:tc>
+      </w:tr>
+      <w:tr>
+        <w:trPr>
+          <w:tblHeader w:val="off"/>
+        </w:trPr>
+        <w:tc>
+          <w:tcPr>
+            <w:tcMar>
+              <w:top w:type="dxa" w:w="60"/>
+              <w:left w:type="dxa" w:w="80"/>
+              <w:bottom w:type="dxa" w:w="60"/>
+              <w:right w:type="dxa" w:w="80"/>
+            </w:tcMar>
+          </w:tcPr>
+          <w:p>
+            <w:r>
+              <w:rPr>
+                <w:rFonts w:ascii="Calibri" w:cs="Calibri" w:eastAsia="Calibri" w:hAnsi="Calibri"/>
+                <w:b w:val="false"/>
+                <w:bCs w:val="false"/>
+                <w:sz w:val="18"/>
+                <w:szCs w:val="18"/>
+              </w:rPr>
+              <w:t xml:space="preserve">8 Oct 2026</w:t>
+            </w:r>
+          </w:p>
+        </w:tc>
+        <w:tc>
+          <w:tcPr>
+            <w:tcMar>
+              <w:top w:type="dxa" w:w="60"/>
+              <w:left w:type="dxa" w:w="80"/>
+              <w:bottom w:type="dxa" w:w="60"/>
+              <w:right w:type="dxa" w:w="80"/>
+            </w:tcMar>
+          </w:tcPr>
+          <w:p>
+            <w:r>
+              <w:rPr>
+                <w:rFonts w:ascii="Calibri" w:cs="Calibri" w:eastAsia="Calibri" w:hAnsi="Calibri"/>
+                <w:b w:val="false"/>
+                <w:bCs w:val="false"/>
+                <w:sz w:val="18"/>
+                <w:szCs w:val="18"/>
+              </w:rPr>
+              <w:t xml:space="preserve">Launch prep</w:t>
+            </w:r>
+          </w:p>
+        </w:tc>
+        <w:tc>
+          <w:tcPr>
+            <w:tcMar>
+              <w:top w:type="dxa" w:w="60"/>
+              <w:left w:type="dxa" w:w="80"/>
+              <w:bottom w:type="dxa" w:w="60"/>
+              <w:right w:type="dxa" w:w="80"/>
+            </w:tcMar>
+          </w:tcPr>
+          <w:p>
+            <w:r>
+              <w:rPr>
+                <w:rFonts w:ascii="Calibri" w:cs="Calibri" w:eastAsia="Calibri" w:hAnsi="Calibri"/>
+                <w:b w:val="false"/>
+                <w:bCs w:val="false"/>
+                <w:sz w:val="18"/>
+                <w:szCs w:val="18"/>
+              </w:rPr>
+              <w:t xml:space="preserve">Consent records (versioned texts published by a super admin once counsel provides the wording; acceptances and withdrawals kept with time and IP); test numbers for store reviewers and testers (fixed code, audited, kept apart from real users in production); a web page for account deletion (same sign-in by SMS code, same rules as in the app).</w:t>
             </w:r>
           </w:p>
         </w:tc>

</xml_diff>

<commit_message>
Interim rule for withdrawn health-data consent
Until counsel answers: a patient who withdraws health-data consent keeps
the account and can book, but their health data is paused. Providers get
no medical summary (medical_summary_withheld: true); medical records,
documents and blood type can't be edited (403
HEALTH_DATA_CONSENT_WITHDRAWN, message = the notice); the profile shows
health_data_paused + notice; the patient is notified. Data is kept.
Consenting again restores everything. Noted for counsel in the data
inventory (question 3).

Co-Authored-By: Claude Opus 5.5 <noreply@anthropic.com>
</commit_message>
<xml_diff>
--- a/docs/DATA_INVENTORY.docx
+++ b/docs/DATA_INVENTORY.docx
@@ -5933,7 +5933,7 @@
                 <w:sz w:val="18"/>
                 <w:szCs w:val="18"/>
               </w:rPr>
-              <w:t xml:space="preserve">Each view is logged; access ends 7 days after the visit</w:t>
+              <w:t xml:space="preserve">Each view is logged; access ends 7 days after the visit; nothing is shared while the patient has withdrawn health-data consent (the provider sees only that it was withheld)</w:t>
             </w:r>
           </w:p>
         </w:tc>
@@ -8753,7 +8753,27 @@
           <w:sz w:val="21"/>
           <w:szCs w:val="21"/>
         </w:rPr>
-        <w:t xml:space="preserve"> What consent must patients give for their health data, and in what wording (Arabic)? (The app is ready to record it: send the texts for the terms, the privacy notice and the health-data consent, and we publish them as version 1; sign-up then requires them, and later changes ask everyone again.) A patient also enters data about family members: what consent is needed from them, and from guardians for children?</w:t>
+        <w:t xml:space="preserve"> What consent must patients give for their health data, and in what wording (Arabic)? (The app is ready to record it: send the texts for the terms, the privacy notice and the health-data consent, and we publish them as version 1; sign-up then requires them, and later changes ask everyone again.) </w:t>
+      </w:r>
+      <w:r>
+        <w:rPr>
+          <w:rFonts w:ascii="Calibri" w:cs="Calibri" w:eastAsia="Calibri" w:hAnsi="Calibri"/>
+          <w:b/>
+          <w:bCs/>
+          <w:sz w:val="21"/>
+          <w:szCs w:val="21"/>
+        </w:rPr>
+        <w:t xml:space="preserve">Interim rule applied until you answer — please confirm or change:</w:t>
+      </w:r>
+      <w:r>
+        <w:rPr>
+          <w:rFonts w:ascii="Calibri" w:cs="Calibri" w:eastAsia="Calibri" w:hAnsi="Calibri"/>
+          <w:b w:val="false"/>
+          <w:bCs w:val="false"/>
+          <w:sz w:val="21"/>
+          <w:szCs w:val="21"/>
+        </w:rPr>
+        <w:t xml:space="preserve"> a patient who withdraws health-data consent keeps their account and can still book, but we stop processing their health data: the medical profile, conditions, medications, allergies and documents of every profile they manage (including family members) are no longer shared with nurses or doctors and can't be edited. The data stays stored, unchanged, and the patient can still view it, with a notice explaining why and how to consent again. Consenting again restores everything. Is this right, and may we keep the stored data while consent is withdrawn? A patient also enters data about family members: what consent is needed from them, and from guardians for children?</w:t>
       </w:r>
     </w:p>
     <w:p>
@@ -9971,6 +9991,77 @@
                 <w:szCs w:val="18"/>
               </w:rPr>
               <w:t xml:space="preserve">Consent records (versioned texts published by a super admin once counsel provides the wording; acceptances and withdrawals kept with time and IP); test numbers for store reviewers and testers (fixed code, audited, kept apart from real users in production); a web page for account deletion (same sign-in by SMS code, same rules as in the app).</w:t>
+            </w:r>
+          </w:p>
+        </w:tc>
+      </w:tr>
+      <w:tr>
+        <w:trPr>
+          <w:tblHeader w:val="off"/>
+        </w:trPr>
+        <w:tc>
+          <w:tcPr>
+            <w:tcMar>
+              <w:top w:type="dxa" w:w="60"/>
+              <w:left w:type="dxa" w:w="80"/>
+              <w:bottom w:type="dxa" w:w="60"/>
+              <w:right w:type="dxa" w:w="80"/>
+            </w:tcMar>
+          </w:tcPr>
+          <w:p>
+            <w:r>
+              <w:rPr>
+                <w:rFonts w:ascii="Calibri" w:cs="Calibri" w:eastAsia="Calibri" w:hAnsi="Calibri"/>
+                <w:b w:val="false"/>
+                <w:bCs w:val="false"/>
+                <w:sz w:val="18"/>
+                <w:szCs w:val="18"/>
+              </w:rPr>
+              <w:t xml:space="preserve">8 Oct 2026</w:t>
+            </w:r>
+          </w:p>
+        </w:tc>
+        <w:tc>
+          <w:tcPr>
+            <w:tcMar>
+              <w:top w:type="dxa" w:w="60"/>
+              <w:left w:type="dxa" w:w="80"/>
+              <w:bottom w:type="dxa" w:w="60"/>
+              <w:right w:type="dxa" w:w="80"/>
+            </w:tcMar>
+          </w:tcPr>
+          <w:p>
+            <w:r>
+              <w:rPr>
+                <w:rFonts w:ascii="Calibri" w:cs="Calibri" w:eastAsia="Calibri" w:hAnsi="Calibri"/>
+                <w:b w:val="false"/>
+                <w:bCs w:val="false"/>
+                <w:sz w:val="18"/>
+                <w:szCs w:val="18"/>
+              </w:rPr>
+              <w:t xml:space="preserve">Launch prep</w:t>
+            </w:r>
+          </w:p>
+        </w:tc>
+        <w:tc>
+          <w:tcPr>
+            <w:tcMar>
+              <w:top w:type="dxa" w:w="60"/>
+              <w:left w:type="dxa" w:w="80"/>
+              <w:bottom w:type="dxa" w:w="60"/>
+              <w:right w:type="dxa" w:w="80"/>
+            </w:tcMar>
+          </w:tcPr>
+          <w:p>
+            <w:r>
+              <w:rPr>
+                <w:rFonts w:ascii="Calibri" w:cs="Calibri" w:eastAsia="Calibri" w:hAnsi="Calibri"/>
+                <w:b w:val="false"/>
+                <w:bCs w:val="false"/>
+                <w:sz w:val="18"/>
+                <w:szCs w:val="18"/>
+              </w:rPr>
+              <w:t xml:space="preserve">Interim rule for withdrawn health-data consent: account and bookings continue; health data kept but no longer shared with providers or editable, with a notice to the patient; consenting again restores it (question 3).</w:t>
             </w:r>
           </w:p>
         </w:tc>

</xml_diff>

<commit_message>
Clinic visits C2: search by clinic area, clinic cards, profile clinics, appointment slots
- GET /providers?visit_type=clinic_visit: approved, active clinics in the
  clinic's area with an approved independent doctor who takes bookings,
  prices the service as a clinic visit and has hours there; one card per
  doctor and clinic (clinic price, no travel fee, clinic name + area,
  never the phone). Date / time filters on clinic appointments.
- Slots with visit_type=clinic_visit&clinic_id: fixed appointments of the
  clinic's length (slotsForDay appointmentMinutes), one calendar per
  doctor via busyIntervals.
- Profile: visit_types and clinics (text address, hours, clinic prices).
- All behind features.clinic_visits; packages stay home-only until C5.

Co-Authored-By: Claude Opus 5.5 <noreply@anthropic.com>
</commit_message>
<xml_diff>
--- a/docs/DATA_INVENTORY.docx
+++ b/docs/DATA_INVENTORY.docx
@@ -6452,7 +6452,7 @@
                 <w:sz w:val="18"/>
                 <w:szCs w:val="18"/>
               </w:rPr>
-              <w:t xml:space="preserve">A provider's public profile: name, photo, experience, rating, reviews (first name + initial)</w:t>
+              <w:t xml:space="preserve">A provider's public profile: name, photo, experience, rating, reviews (first name + initial); for doctors with clinic visits, each approved clinic's name, text address and hours (never the clinic phone, which is shown only after booking)</w:t>
             </w:r>
           </w:p>
         </w:tc>
@@ -10338,6 +10338,77 @@
                 <w:szCs w:val="18"/>
               </w:rPr>
               <w:t xml:space="preserve">Interim rule for withdrawn health-data consent: account and bookings continue; health data kept but no longer shared with providers or editable, with a notice to the patient; consenting again restores it (question 3).</w:t>
+            </w:r>
+          </w:p>
+        </w:tc>
+      </w:tr>
+      <w:tr>
+        <w:trPr>
+          <w:tblHeader w:val="off"/>
+        </w:trPr>
+        <w:tc>
+          <w:tcPr>
+            <w:tcMar>
+              <w:top w:type="dxa" w:w="60"/>
+              <w:left w:type="dxa" w:w="80"/>
+              <w:bottom w:type="dxa" w:w="60"/>
+              <w:right w:type="dxa" w:w="80"/>
+            </w:tcMar>
+          </w:tcPr>
+          <w:p>
+            <w:r>
+              <w:rPr>
+                <w:rFonts w:ascii="Calibri" w:cs="Calibri" w:eastAsia="Calibri" w:hAnsi="Calibri"/>
+                <w:b w:val="false"/>
+                <w:bCs w:val="false"/>
+                <w:sz w:val="18"/>
+                <w:szCs w:val="18"/>
+              </w:rPr>
+              <w:t xml:space="preserve">8 Oct 2026</w:t>
+            </w:r>
+          </w:p>
+        </w:tc>
+        <w:tc>
+          <w:tcPr>
+            <w:tcMar>
+              <w:top w:type="dxa" w:w="60"/>
+              <w:left w:type="dxa" w:w="80"/>
+              <w:bottom w:type="dxa" w:w="60"/>
+              <w:right w:type="dxa" w:w="80"/>
+            </w:tcMar>
+          </w:tcPr>
+          <w:p>
+            <w:r>
+              <w:rPr>
+                <w:rFonts w:ascii="Calibri" w:cs="Calibri" w:eastAsia="Calibri" w:hAnsi="Calibri"/>
+                <w:b w:val="false"/>
+                <w:bCs w:val="false"/>
+                <w:sz w:val="18"/>
+                <w:szCs w:val="18"/>
+              </w:rPr>
+              <w:t xml:space="preserve">Clinic visits C2</w:t>
+            </w:r>
+          </w:p>
+        </w:tc>
+        <w:tc>
+          <w:tcPr>
+            <w:tcMar>
+              <w:top w:type="dxa" w:w="60"/>
+              <w:left w:type="dxa" w:w="80"/>
+              <w:bottom w:type="dxa" w:w="60"/>
+              <w:right w:type="dxa" w:w="80"/>
+            </w:tcMar>
+          </w:tcPr>
+          <w:p>
+            <w:r>
+              <w:rPr>
+                <w:rFonts w:ascii="Calibri" w:cs="Calibri" w:eastAsia="Calibri" w:hAnsi="Calibri"/>
+                <w:b w:val="false"/>
+                <w:bCs w:val="false"/>
+                <w:sz w:val="18"/>
+                <w:szCs w:val="18"/>
+              </w:rPr>
+              <w:t xml:space="preserve">Patients can find clinics by area and see a clinic's name, text address and hours on the doctor's profile (not its phone). Still off until launch.</w:t>
             </w:r>
           </w:p>
         </w:tc>

</xml_diff>

<commit_message>
Clinic visits C5: packages and promo codes by visit type, admin filters and analytics, licence expiry
- Packages carry a visit type (snapshot on subscriptions, checked when used); home packages no longer match clinic prices
- Promo codes can be limited to visit types; /promo-codes/validate takes visit_type
- Admin bookings and analytics filter by visit_type; attention list adds clinic visits never started
- Clinic licence expiry: one notice 30 days ahead, expired licence sends the clinic back for changes
- Mobile change notes for clinic visits; data inventory, build plan, API reference updated

Co-Authored-By: Claude Opus 5.5 <noreply@anthropic.com>
</commit_message>
<xml_diff>
--- a/docs/DATA_INVENTORY.docx
+++ b/docs/DATA_INVENTORY.docx
@@ -10409,6 +10409,77 @@
                 <w:szCs w:val="18"/>
               </w:rPr>
               <w:t xml:space="preserve">Interim rule for withdrawn health-data consent: account and bookings continue; health data kept but no longer shared with providers or editable, with a notice to the patient; consenting again restores it (question 3).</w:t>
+            </w:r>
+          </w:p>
+        </w:tc>
+      </w:tr>
+      <w:tr>
+        <w:trPr>
+          <w:tblHeader w:val="off"/>
+        </w:trPr>
+        <w:tc>
+          <w:tcPr>
+            <w:tcMar>
+              <w:top w:type="dxa" w:w="60"/>
+              <w:left w:type="dxa" w:w="80"/>
+              <w:bottom w:type="dxa" w:w="60"/>
+              <w:right w:type="dxa" w:w="80"/>
+            </w:tcMar>
+          </w:tcPr>
+          <w:p>
+            <w:r>
+              <w:rPr>
+                <w:rFonts w:ascii="Calibri" w:cs="Calibri" w:eastAsia="Calibri" w:hAnsi="Calibri"/>
+                <w:b w:val="false"/>
+                <w:bCs w:val="false"/>
+                <w:sz w:val="18"/>
+                <w:szCs w:val="18"/>
+              </w:rPr>
+              <w:t xml:space="preserve">8 Oct 2026</w:t>
+            </w:r>
+          </w:p>
+        </w:tc>
+        <w:tc>
+          <w:tcPr>
+            <w:tcMar>
+              <w:top w:type="dxa" w:w="60"/>
+              <w:left w:type="dxa" w:w="80"/>
+              <w:bottom w:type="dxa" w:w="60"/>
+              <w:right w:type="dxa" w:w="80"/>
+            </w:tcMar>
+          </w:tcPr>
+          <w:p>
+            <w:r>
+              <w:rPr>
+                <w:rFonts w:ascii="Calibri" w:cs="Calibri" w:eastAsia="Calibri" w:hAnsi="Calibri"/>
+                <w:b w:val="false"/>
+                <w:bCs w:val="false"/>
+                <w:sz w:val="18"/>
+                <w:szCs w:val="18"/>
+              </w:rPr>
+              <w:t xml:space="preserve">Clinic visits C5</w:t>
+            </w:r>
+          </w:p>
+        </w:tc>
+        <w:tc>
+          <w:tcPr>
+            <w:tcMar>
+              <w:top w:type="dxa" w:w="60"/>
+              <w:left w:type="dxa" w:w="80"/>
+              <w:bottom w:type="dxa" w:w="60"/>
+              <w:right w:type="dxa" w:w="80"/>
+            </w:tcMar>
+          </w:tcPr>
+          <w:p>
+            <w:r>
+              <w:rPr>
+                <w:rFonts w:ascii="Calibri" w:cs="Calibri" w:eastAsia="Calibri" w:hAnsi="Calibri"/>
+                <w:b w:val="false"/>
+                <w:bCs w:val="false"/>
+                <w:sz w:val="18"/>
+                <w:szCs w:val="18"/>
+              </w:rPr>
+              <w:t xml:space="preserve">Packages and promo codes by visit type, admin filters (no new personal data); clinic licence expiry warnings to the doctor or owner. The clinic-visits feature is complete and switched off until launch.</w:t>
             </w:r>
           </w:p>
         </w:tc>

</xml_diff>